<commit_message>
Add EC2 evidence and clarify webhook status
Co-authored-by: Copilot <223556219+Copilot@users.noreply.github.com>
</commit_message>
<xml_diff>
--- a/Jenkins_CICD_Shreyas_Damle_Documentation.docx
+++ b/Jenkins_CICD_Shreyas_Damle_Documentation.docx
@@ -789,7 +789,7 @@
         <w:pStyle w:val="Code"/>
       </w:pPr>
       <w:r>
-        <w:t xml:space="preserve">     | one push webhook</w:t>
+        <w:t xml:space="preserve">     | planned push webhook (not yet configured)</w:t>
       </w:r>
     </w:p>
     <w:p>
@@ -909,15 +909,15 @@
         <w:pStyle w:val="Normal"/>
       </w:pPr>
       <w:r>
-        <w:t>The evidence folder contains the supplied Jenkins build screenshots and an EC2 terminal verification record. Genuine EC2-console and GitHub webhook-delivery screenshots remain outstanding.</w:t>
-      </w:r>
-    </w:p>
-    <w:p>
-      <w:pPr>
-        <w:pStyle w:val="Normal"/>
-      </w:pPr>
-      <w:r>
-        <w:t>At verification time, the GitHub repository had no webhook configured. Configure and test the webhook, capture its successful delivery and the EC2 screenshots, then recreate the submission ZIP. Do not claim unverified webhook evidence.</w:t>
+        <w:t>The evidence folder contains the Jenkins build screenshots, a redacted EC2 running-instance screenshot, and a terminal verification record. The supplied GitHub Webhooks screenshot shows that no webhook was configured when captured; it is not evidence of a successful delivery.</w:t>
+      </w:r>
+    </w:p>
+    <w:p>
+      <w:pPr>
+        <w:pStyle w:val="Normal"/>
+      </w:pPr>
+      <w:r>
+        <w:t>At verification time, the GitHub repository had no webhook configured. Configure and test the push webhook, capture its successful delivery and a terminal screenshot of the app checks, then recreate the submission ZIP. Do not claim unverified webhook evidence.</w:t>
       </w:r>
     </w:p>
     <w:sectPr>

</xml_diff>

<commit_message>
Document verified GitHub webhook deployment
Co-authored-by: Copilot <223556219+Copilot@users.noreply.github.com>
</commit_message>
<xml_diff>
--- a/Jenkins_CICD_Shreyas_Damle_Documentation.docx
+++ b/Jenkins_CICD_Shreyas_Damle_Documentation.docx
@@ -631,15 +631,15 @@
         <w:pStyle w:val="Code"/>
       </w:pPr>
       <w:r>
-        <w:t>The repository currently has no GitHub webhook configured. For this shared repository, add one push-event webhook only after Jenkins is reachable through a secured HTTPS endpoint; avoid exposing Jenkins over unauthenticated plain HTTP.</w:t>
-      </w:r>
-    </w:p>
-    <w:p>
-      <w:pPr>
-        <w:pStyle w:val="Code"/>
-      </w:pPr>
-      <w:r>
-        <w:t>Use the Jenkins GitHub webhook endpoint: https://YOUR_SECURED_JENKINS_HOST/github-webhook/ . Confirm a successful delivery and that a push to the configured branch starts the Jenkins jobs.</w:t>
+        <w:t>A GitHub push webhook is configured and verified. On October 19, 2026, a push to main delivered successfully (HTTP 200) and triggered both Jenkins jobs. For production, protect Jenkins and the webhook endpoint with HTTPS and restrict network access.</w:t>
+      </w:r>
+    </w:p>
+    <w:p>
+      <w:pPr>
+        <w:pStyle w:val="Code"/>
+      </w:pPr>
+      <w:r>
+        <w:t>The configured Jenkins endpoint is http://13.201.125.112:8080/github-webhook/. The test push triggered Flask build #7 and Express build #4; both finished SUCCESS. See evidence/06-github-webhook-push-delivery.txt for the verification record.</w:t>
       </w:r>
     </w:p>
     <w:p>
@@ -789,7 +789,7 @@
         <w:pStyle w:val="Code"/>
       </w:pPr>
       <w:r>
-        <w:t xml:space="preserve">     | planned push webhook (not yet configured)</w:t>
+        <w:t xml:space="preserve">     | verified push webhook</w:t>
       </w:r>
     </w:p>
     <w:p>
@@ -917,7 +917,7 @@
         <w:pStyle w:val="Normal"/>
       </w:pPr>
       <w:r>
-        <w:t>At verification time, the GitHub repository had no webhook configured. Configure and test the push webhook, capture its successful delivery and a terminal screenshot of the app checks, then recreate the submission ZIP. Do not claim unverified webhook evidence.</w:t>
+        <w:t>On October 19, 2026, push commit 4e77fb92a1580a41dc93687d1d965b9b84cd36fe generated GitHub webhook delivery 3849213520174407700 (push, HTTP 200). It triggered Flask build #7 and Express build #4; both finished SUCCESS. PM2 showed both services online and both health endpoints returned {"status":"healthy"}. See evidence/06-github-webhook-push-delivery.txt for the verification record. The GitHub Webhooks settings screenshot shows the earlier empty state and predates webhook setup.</w:t>
       </w:r>
     </w:p>
     <w:sectPr>

</xml_diff>

<commit_message>
Add EC2 terminal deployment evidence
Co-authored-by: Copilot <223556219+Copilot@users.noreply.github.com>
</commit_message>
<xml_diff>
--- a/Jenkins_CICD_Shreyas_Damle_Documentation.docx
+++ b/Jenkins_CICD_Shreyas_Damle_Documentation.docx
@@ -918,6 +918,70 @@
       </w:pPr>
       <w:r>
         <w:t>On October 19, 2026, push commit 4e77fb92a1580a41dc93687d1d965b9b84cd36fe generated GitHub webhook delivery 3849213520174407700 (push, HTTP 200). It triggered Flask build #7 and Express build #4; both finished SUCCESS. PM2 showed both services online and both health endpoints returned {"status":"healthy"}. See evidence/06-github-webhook-push-delivery.txt for the verification record. The GitHub Webhooks settings screenshot shows the earlier empty state and predates webhook setup.</w:t>
+      </w:r>
+    </w:p>
+    <w:p>
+      <w:pPr>
+        <w:pStyle w:val="Heading1"/>
+      </w:pPr>
+      <w:r>
+        <w:t>EC2 Process and Health Check Evidence</w:t>
+      </w:r>
+    </w:p>
+    <w:p>
+      <w:r>
+        <w:t>The terminal screenshot below shows both PM2 processes online and the Flask health endpoint returning healthy. The Express health command is visible, but its response is below the captured area; the accompanying evidence/02-ec2-app-health-checks.txt record contains the successful responses for both endpoints.</w:t>
+      </w:r>
+    </w:p>
+    <w:p>
+      <w:pPr>
+        <w:jc w:val="center"/>
+      </w:pPr>
+      <w:r>
+        <w:drawing>
+          <wp:inline xmlns:wp="http://schemas.openxmlformats.org/drawingml/2006/wordprocessingDrawing" xmlns:a="http://schemas.openxmlformats.org/drawingml/2006/main" xmlns:pic="http://schemas.openxmlformats.org/drawingml/2006/picture" xmlns:r="http://schemas.openxmlformats.org/officeDocument/2006/relationships">
+            <wp:extent cx="5943600" cy="1214284"/>
+            <wp:docPr id="1" name="Picture 1"/>
+            <wp:cNvGraphicFramePr>
+              <a:graphicFrameLocks noChangeAspect="1"/>
+            </wp:cNvGraphicFramePr>
+            <a:graphic>
+              <a:graphicData uri="http://schemas.openxmlformats.org/drawingml/2006/picture">
+                <pic:pic>
+                  <pic:nvPicPr>
+                    <pic:cNvPr id="0" name="02-ec2-app-health-checks.png"/>
+                    <pic:cNvPicPr/>
+                  </pic:nvPicPr>
+                  <pic:blipFill>
+                    <a:blip r:embed="rId2"/>
+                    <a:stretch>
+                      <a:fillRect/>
+                    </a:stretch>
+                  </pic:blipFill>
+                  <pic:spPr>
+                    <a:xfrm>
+                      <a:off x="0" y="0"/>
+                      <a:ext cx="5943600" cy="1214284"/>
+                    </a:xfrm>
+                    <a:prstGeom prst="rect"/>
+                  </pic:spPr>
+                </pic:pic>
+              </a:graphicData>
+            </a:graphic>
+          </wp:inline>
+        </w:drawing>
+      </w:r>
+    </w:p>
+    <w:p>
+      <w:pPr>
+        <w:jc w:val="center"/>
+      </w:pPr>
+      <w:r>
+        <w:rPr>
+          <w:i/>
+          <w:sz w:val="18"/>
+        </w:rPr>
+        <w:t>EC2 terminal: PM2 processes online and Flask health endpoint healthy.</w:t>
       </w:r>
     </w:p>
     <w:sectPr>

</xml_diff>

<commit_message>
Update complete EC2 health check screenshot
Co-authored-by: Copilot <223556219+Copilot@users.noreply.github.com>
</commit_message>
<xml_diff>
--- a/Jenkins_CICD_Shreyas_Damle_Documentation.docx
+++ b/Jenkins_CICD_Shreyas_Damle_Documentation.docx
@@ -930,7 +930,7 @@
     </w:p>
     <w:p>
       <w:r>
-        <w:t>The terminal screenshot below shows both PM2 processes online and the Flask health endpoint returning healthy. The Express health command is visible, but its response is below the captured area; the accompanying evidence/02-ec2-app-health-checks.txt record contains the successful responses for both endpoints.</w:t>
+        <w:t>This terminal screenshot shows both PM2 processes online and both Flask and Express health endpoints returning {"status":"healthy"}. The accompanying evidence/02-ec2-app-health-checks.txt file contains the full verification record.</w:t>
       </w:r>
     </w:p>
     <w:p>
@@ -940,7 +940,7 @@
       <w:r>
         <w:drawing>
           <wp:inline xmlns:wp="http://schemas.openxmlformats.org/drawingml/2006/wordprocessingDrawing" xmlns:a="http://schemas.openxmlformats.org/drawingml/2006/main" xmlns:pic="http://schemas.openxmlformats.org/drawingml/2006/picture" xmlns:r="http://schemas.openxmlformats.org/officeDocument/2006/relationships">
-            <wp:extent cx="5943600" cy="1214284"/>
+            <wp:extent cx="5943600" cy="1885289"/>
             <wp:docPr id="1" name="Picture 1"/>
             <wp:cNvGraphicFramePr>
               <a:graphicFrameLocks noChangeAspect="1"/>
@@ -953,7 +953,7 @@
                     <pic:cNvPicPr/>
                   </pic:nvPicPr>
                   <pic:blipFill>
-                    <a:blip r:embed="rId2"/>
+                    <a:blip r:embed="rId3"/>
                     <a:stretch>
                       <a:fillRect/>
                     </a:stretch>
@@ -961,7 +961,7 @@
                   <pic:spPr>
                     <a:xfrm>
                       <a:off x="0" y="0"/>
-                      <a:ext cx="5943600" cy="1214284"/>
+                      <a:ext cx="5943600" cy="1885289"/>
                     </a:xfrm>
                     <a:prstGeom prst="rect"/>
                   </pic:spPr>
@@ -977,11 +977,7 @@
         <w:jc w:val="center"/>
       </w:pPr>
       <w:r>
-        <w:rPr>
-          <w:i/>
-          <w:sz w:val="18"/>
-        </w:rPr>
-        <w:t>EC2 terminal: PM2 processes online and Flask health endpoint healthy.</w:t>
+        <w:t>EC2 terminal: both PM2 processes online and both health endpoints healthy.</w:t>
       </w:r>
     </w:p>
     <w:sectPr>

</xml_diff>